<commit_message>
updating .ignore to excluse Mac files .DS_...
</commit_message>
<xml_diff>
--- a/Spring and Spring Boot Notes Dec 2020.docx
+++ b/Spring and Spring Boot Notes Dec 2020.docx
@@ -7,6 +7,8 @@
         <w:spacing w:after="0" w:line="259" w:lineRule="auto"/>
         <w:ind w:left="0" w:firstLine="0"/>
       </w:pPr>
+      <w:bookmarkStart w:id="0" w:name="OLE_LINK16"/>
+      <w:bookmarkStart w:id="1" w:name="OLE_LINK17"/>
       <w:r>
         <w:rPr>
           <w:sz w:val="52"/>
@@ -3195,6 +3197,8 @@
       <w:r>
         <w:t xml:space="preserve"> </w:t>
       </w:r>
+      <w:bookmarkEnd w:id="0"/>
+      <w:bookmarkEnd w:id="1"/>
     </w:p>
     <w:sectPr>
       <w:pgSz w:w="12240" w:h="15840"/>

</xml_diff>